<commit_message>
feat: Set up initial frontend application with applicant and staff portals and backend configuration.
</commit_message>
<xml_diff>
--- a/Ats Resume Jesin.docx
+++ b/Ats Resume Jesin.docx
@@ -33,6 +33,13 @@
           <w:sz w:val="28"/>
           <w:szCs w:val="28"/>
         </w:rPr>
+        <w:t xml:space="preserve">JAVA </w:t>
+      </w:r>
+      <w:r>
+        <w:rPr>
+          <w:sz w:val="28"/>
+          <w:szCs w:val="28"/>
+        </w:rPr>
         <w:t>Full Stack Web Developer</w:t>
       </w:r>
     </w:p>
@@ -114,7 +121,10 @@
         </w:numPr>
       </w:pPr>
       <w:r>
-        <w:t>Back-End: Python</w:t>
+        <w:t xml:space="preserve">Back-End: </w:t>
+      </w:r>
+      <w:r>
+        <w:t>JAVA</w:t>
       </w:r>
     </w:p>
     <w:p>
@@ -126,7 +136,13 @@
         </w:numPr>
       </w:pPr>
       <w:r>
-        <w:t>Database: SQL</w:t>
+        <w:t xml:space="preserve">Database: </w:t>
+      </w:r>
+      <w:r>
+        <w:t>My</w:t>
+      </w:r>
+      <w:r>
+        <w:t>SQL</w:t>
       </w:r>
     </w:p>
     <w:p>
@@ -187,7 +203,10 @@
       </w:r>
       <w:r>
         <w:br/>
-        <w:t>CGPA: 8.02</w:t>
+        <w:t>CGPA: 8.</w:t>
+      </w:r>
+      <w:r>
+        <w:t>81</w:t>
       </w:r>
     </w:p>
     <w:p>

</xml_diff>